<commit_message>
Sandy & Junior: gancho mais enxuto, um único mistério
Co-Authored-By: Claude Opus 5.5 <noreply@anthropic.com>
Claude-Session: https://claude.ai/code/session_01MJjUEEZrxQDEUifKK2vj9g
</commit_message>
<xml_diff>
--- a/roteiros/sandy-junior/SJ_Parte1.docx
+++ b/roteiros/sandy-junior/SJ_Parte1.docx
@@ -23,7 +23,7 @@
         <w:rPr>
           <w:color w:val="C00000"/>
         </w:rPr>
-        <w:t>O que pouca gente sabe é que a primeira música que eles cantaram na televisão, aos seis e aos cinco anos, terminava com um homem ameaçando matar a própria mulher. E aquilo foi só o começo.</w:t>
+        <w:t>O que pouca gente sabe é que tudo começou com uma música que eles cantaram aos seis e aos cinco anos. Uma música com um final tão macabro que, trinta anos depois, a própria Sandy não deixa tocar dentro de casa.</w:t>
       </w:r>
     </w:p>
     <w:p>
@@ -31,7 +31,7 @@
         <w:rPr>
           <w:color w:val="C00000"/>
         </w:rPr>
-        <w:t>Fique até o final, porque você vai descobrir o que fizeram com Sandy quando ela tinha só catorze anos. E a tragédia que fez Junior perder dois amigos no mesmo ano.</w:t>
+        <w:t>Fique até o final, porque você vai descobrir o que essa música escondia. E o que ela tem a ver com tudo o que aconteceu com os dois depois.</w:t>
       </w:r>
     </w:p>
     <w:p>
@@ -287,7 +287,7 @@
         <w:rPr>
           <w:color w:val="C00000"/>
         </w:rPr>
-        <w:t>Vamos voltar a esse final daqui a pouco. Porque o que Genaro promete fazer com Maria Chiquinha nos últimos versos é tão macabro que, mais de trinta anos depois, a própria Sandy tomou uma decisão sobre essa música dentro da casa dela.</w:t>
+        <w:t>Vamos voltar a esse final daqui a pouco. Porque o que Genaro promete fazer com Maria Chiquinha nos últimos versos é a primeira coisa sombria que essas duas crianças carregaram sem saber. E não seria a última.</w:t>
       </w:r>
     </w:p>
     <w:p>

</xml_diff>

<commit_message>
Sandy & Junior: gancho sobre o segredo entre os irmãos
Co-Authored-By: Claude Opus 5.5 <noreply@anthropic.com>
Claude-Session: https://claude.ai/code/session_01MJjUEEZrxQDEUifKK2vj9g
</commit_message>
<xml_diff>
--- a/roteiros/sandy-junior/SJ_Parte1.docx
+++ b/roteiros/sandy-junior/SJ_Parte1.docx
@@ -15,7 +15,7 @@
         <w:rPr>
           <w:color w:val="C00000"/>
         </w:rPr>
-        <w:t>Sandy e Junior passaram anos sendo a dupla mais pura do Brasil. Mas, longe das câmeras, os dois irmãos carregavam um peso sombrio que quase ninguém enxergou.</w:t>
+        <w:t>Sandy e Junior passaram dezoito anos sendo a dupla de irmãos mais amada do Brasil. Mas, longe dos palcos, um dos dois sofria em silêncio por causa do outro.</w:t>
       </w:r>
     </w:p>
     <w:p>
@@ -23,7 +23,7 @@
         <w:rPr>
           <w:color w:val="C00000"/>
         </w:rPr>
-        <w:t>O que pouca gente sabe é que tudo começou com uma música que eles cantaram aos seis e aos cinco anos. Uma música com um final tão macabro que, trinta anos depois, a própria Sandy não deixa tocar dentro de casa.</w:t>
+        <w:t>O que pouca gente sabe é que esse sofrimento virou um segredo guardado dentro da própria família. E terminou numa decisão que nem o pai deles conseguiu impedir.</w:t>
       </w:r>
     </w:p>
     <w:p>
@@ -31,7 +31,7 @@
         <w:rPr>
           <w:color w:val="C00000"/>
         </w:rPr>
-        <w:t>Fique até o final, porque você vai descobrir o que essa música escondia. E o que ela tem a ver com tudo o que aconteceu com os dois depois.</w:t>
+        <w:t>Fique até o final, porque você vai descobrir qual dos dois carregava essa dor. E o segredo sombrio que separou os irmãos mais famosos do Brasil.</w:t>
       </w:r>
     </w:p>
     <w:p>
@@ -39,7 +39,7 @@
         <w:rPr>
           <w:color w:val="000000"/>
         </w:rPr>
-        <w:t>Para entender como duas crianças foram parar dentro de uma história tão pesada, é preciso voltar para uma casa em Campinas, no interior de São Paulo.</w:t>
+        <w:t>Para entender como dois irmãos inseparáveis chegaram a esse ponto, é preciso voltar para uma casa em Campinas, no interior de São Paulo.</w:t>
       </w:r>
     </w:p>
     <w:p>
@@ -104,6 +104,14 @@
           <w:color w:val="000000"/>
         </w:rPr>
         <w:t>Os dois cresceram grudados. Estudavam no mesmo colégio de freiras em Campinas, o Notre Dame, e passavam as tardes juntos.</w:t>
+      </w:r>
+    </w:p>
+    <w:p>
+      <w:r>
+        <w:rPr>
+          <w:color w:val="000000"/>
+        </w:rPr>
+        <w:t>Repare nessa imagem. Dois irmãos inseparáveis. Porque é justamente entre eles que esta história fica mais sombria.</w:t>
       </w:r>
     </w:p>
     <w:p>

</xml_diff>

<commit_message>
Sandy & Junior: revisão da Parte 1
Co-Authored-By: Claude Opus 5.5 <noreply@anthropic.com>
Claude-Session: https://claude.ai/code/session_01MJjUEEZrxQDEUifKK2vj9g
</commit_message>
<xml_diff>
--- a/roteiros/sandy-junior/SJ_Parte1.docx
+++ b/roteiros/sandy-junior/SJ_Parte1.docx
@@ -15,7 +15,7 @@
         <w:rPr>
           <w:color w:val="C00000"/>
         </w:rPr>
-        <w:t>Sandy e Junior passaram dezoito anos sendo a dupla de irmãos mais amada do Brasil. Mas, longe dos palcos, um dos dois sofria em silêncio por causa do outro.</w:t>
+        <w:t>Sandy e Junior passaram dezoito anos sendo a dupla de irmãos mais amada do Brasil. Mas, longe dos palcos, um dos dois sofria em silêncio por viver à sombra do outro.</w:t>
       </w:r>
     </w:p>
     <w:p>
@@ -23,7 +23,7 @@
         <w:rPr>
           <w:color w:val="C00000"/>
         </w:rPr>
-        <w:t>O que pouca gente sabe é que esse sofrimento virou um segredo guardado dentro da própria família. E terminou numa decisão que nem o pai deles conseguiu impedir.</w:t>
+        <w:t>O que pouca gente sabe é que esse sofrimento virou um segredo guardado dentro da própria família. E terminou numa decisão que o próprio pai deles nunca teria tomado.</w:t>
       </w:r>
     </w:p>
     <w:p>
@@ -279,7 +279,7 @@
         <w:rPr>
           <w:color w:val="000000"/>
         </w:rPr>
-        <w:t>Duas crianças de seis e cinco anos, cantando sobre ciúme e traição sem entender uma palavra do que diziam.</w:t>
+        <w:t>Duas crianças de seis e cinco anos, cantando sobre ciúme e traição sem entender o que aquela letra dizia.</w:t>
       </w:r>
     </w:p>
     <w:p>
@@ -287,7 +287,7 @@
         <w:rPr>
           <w:color w:val="000000"/>
         </w:rPr>
-        <w:t>E, no fim da música, vinha a parte que ninguém comentava.</w:t>
+        <w:t>No fim da música, vinha a parte que ninguém comentava.</w:t>
       </w:r>
     </w:p>
     <w:p>
@@ -311,7 +311,7 @@
         <w:rPr>
           <w:color w:val="000000"/>
         </w:rPr>
-        <w:t>E alguém teve uma ideia que mudou tudo.</w:t>
+        <w:t>Alguém teve uma ideia que mudou tudo.</w:t>
       </w:r>
     </w:p>
     <w:p>
@@ -327,7 +327,7 @@
         <w:rPr>
           <w:color w:val="000000"/>
         </w:rPr>
-        <w:t>Uma gravação feita quase por acaso, num programa de domingo, virou o começo de uma máquina.</w:t>
+        <w:t>Uma gravação feita quase por acaso, num programa de televisão, virou o começo de uma máquina.</w:t>
       </w:r>
     </w:p>
     <w:p>
@@ -335,7 +335,7 @@
         <w:rPr>
           <w:color w:val="000000"/>
         </w:rPr>
-        <w:t>Guarde também essa gravação. A fita com as vozes de duas crianças que ainda não sabiam o que era fama.</w:t>
+        <w:t>Fique com essa gravação na cabeça. A fita com as vozes de duas crianças que ainda não sabiam o que era fama.</w:t>
       </w:r>
     </w:p>
     <w:p>
@@ -351,7 +351,7 @@
         <w:rPr>
           <w:color w:val="000000"/>
         </w:rPr>
-        <w:t>Empresários queriam comprar shows. Gravadoras queriam gravar um disco com as crianças. Todo mundo queria um pedaço da dupla que tinha nascido numa tarde de gravação.</w:t>
+        <w:t>Empresários queriam comprar shows. Gravadoras queriam gravar um disco com as crianças. Todo mundo queria um pedaço da dupla que tinha nascido numa única gravação.</w:t>
       </w:r>
     </w:p>
     <w:p>
@@ -423,7 +423,7 @@
         <w:rPr>
           <w:color w:val="000000"/>
         </w:rPr>
-        <w:t>E, na lista de músicas daquele disco, estava ela outra vez. Maria Chiquinha. Agora gravada em estúdio, para tocar em festas e escolas do Brasil inteiro.</w:t>
+        <w:t>Na lista de músicas daquele disco, estava ela outra vez. Maria Chiquinha. Agora gravada em estúdio, para tocar em festas e escolas do Brasil inteiro.</w:t>
       </w:r>
     </w:p>
     <w:p>
@@ -447,7 +447,7 @@
         <w:rPr>
           <w:color w:val="C00000"/>
         </w:rPr>
-        <w:t>E aqui está a primeira coisa que ninguém conectou na época. Daquele dia em diante, a vida de Sandy e Junior deixou de pertencer só a eles. A partir do momento em que aquele disco chegou às lojas, cada passo das duas crianças passou a ser observado. E, alguns anos depois, até a vida íntima de uma menina de catorze anos virou assunto em rede nacional.</w:t>
+        <w:t>Aqui está a primeira coisa que ninguém conectou na época. Daquele dia em diante, a vida de Sandy e Junior deixou de pertencer só a eles. A partir do momento em que aquele disco chegou às lojas, cada passo das duas crianças passou a ser observado. E, alguns anos depois, até a vida íntima de uma menina de catorze anos virou assunto em rede nacional.</w:t>
       </w:r>
     </w:p>
     <w:sectPr>

</xml_diff>